<commit_message>
Atualizações no diário de bordo, incluindo a remoção de arquivos temporários e ajustes no conteúdo do documento principal.
</commit_message>
<xml_diff>
--- a/Diario_de_bordo.docx
+++ b/Diario_de_bordo.docx
@@ -16,7 +16,23 @@
           <w:b/>
           <w:bCs/>
         </w:rPr>
-        <w:t>Rascunhos do Pré-Projeto:</w:t>
+        <w:t>Rascunhos do Pré-Projeto</w:t>
+      </w:r>
+      <w:r>
+        <w:rPr>
+          <w:rFonts w:ascii="Arial" w:hAnsi="Arial" w:cs="Arial"/>
+          <w:b/>
+          <w:bCs/>
+        </w:rPr>
+        <w:t xml:space="preserve"> – Diário de Bordo</w:t>
+      </w:r>
+      <w:r>
+        <w:rPr>
+          <w:rFonts w:ascii="Arial" w:hAnsi="Arial" w:cs="Arial"/>
+          <w:b/>
+          <w:bCs/>
+        </w:rPr>
+        <w:t>:</w:t>
       </w:r>
     </w:p>
     <w:p>
@@ -234,6 +250,8 @@
       <w:r>
         <w:rPr>
           <w:rFonts w:ascii="Arial" w:hAnsi="Arial" w:cs="Arial"/>
+          <w:i/>
+          <w:iCs/>
         </w:rPr>
         <w:t>dataset</w:t>
       </w:r>
@@ -270,15 +288,26 @@
       <w:r>
         <w:rPr>
           <w:rFonts w:ascii="Arial" w:hAnsi="Arial" w:cs="Arial"/>
+          <w:b/>
+          <w:bCs/>
         </w:rPr>
         <w:t xml:space="preserve">- </w:t>
       </w:r>
       <w:r>
         <w:rPr>
           <w:rFonts w:ascii="Arial" w:hAnsi="Arial" w:cs="Arial"/>
+          <w:b/>
+          <w:bCs/>
           <w:lang w:val="pt-PT"/>
         </w:rPr>
-        <w:t>Sem demência: Ressonância magnética cerebral normal, sem indícios de demência.</w:t>
+        <w:t>Sem demência:</w:t>
+      </w:r>
+      <w:r>
+        <w:rPr>
+          <w:rFonts w:ascii="Arial" w:hAnsi="Arial" w:cs="Arial"/>
+          <w:lang w:val="pt-PT"/>
+        </w:rPr>
+        <w:t xml:space="preserve"> Ressonância magnética cerebral normal, sem indícios de demência.</w:t>
       </w:r>
     </w:p>
     <w:p>
@@ -292,6 +321,8 @@
       <w:r>
         <w:rPr>
           <w:rFonts w:ascii="Arial" w:hAnsi="Arial" w:cs="Arial"/>
+          <w:b/>
+          <w:bCs/>
           <w:lang w:val="pt-PT"/>
         </w:rPr>
         <w:t xml:space="preserve">- </w:t>
@@ -299,9 +330,18 @@
       <w:r>
         <w:rPr>
           <w:rFonts w:ascii="Arial" w:hAnsi="Arial" w:cs="Arial"/>
+          <w:b/>
+          <w:bCs/>
           <w:lang w:val="pt-PT"/>
         </w:rPr>
-        <w:t>Demência muito leve: Declínio cognitivo em estágio inicial, com sintomas muito sutis.</w:t>
+        <w:t>Demência muito leve:</w:t>
+      </w:r>
+      <w:r>
+        <w:rPr>
+          <w:rFonts w:ascii="Arial" w:hAnsi="Arial" w:cs="Arial"/>
+          <w:lang w:val="pt-PT"/>
+        </w:rPr>
+        <w:t xml:space="preserve"> Declínio cognitivo em estágio inicial, com sintomas muito sutis.</w:t>
       </w:r>
     </w:p>
     <w:p>
@@ -315,6 +355,8 @@
       <w:r>
         <w:rPr>
           <w:rFonts w:ascii="Arial" w:hAnsi="Arial" w:cs="Arial"/>
+          <w:b/>
+          <w:bCs/>
           <w:lang w:val="pt-PT"/>
         </w:rPr>
         <w:t xml:space="preserve">- </w:t>
@@ -322,9 +364,18 @@
       <w:r>
         <w:rPr>
           <w:rFonts w:ascii="Arial" w:hAnsi="Arial" w:cs="Arial"/>
+          <w:b/>
+          <w:bCs/>
           <w:lang w:val="pt-PT"/>
         </w:rPr>
-        <w:t>Demência leve: Alterações cerebrais visíveis, porém iniciais, associadas à demência.</w:t>
+        <w:t>Demência leve:</w:t>
+      </w:r>
+      <w:r>
+        <w:rPr>
+          <w:rFonts w:ascii="Arial" w:hAnsi="Arial" w:cs="Arial"/>
+          <w:lang w:val="pt-PT"/>
+        </w:rPr>
+        <w:t xml:space="preserve"> Alterações cerebrais visíveis, porém iniciais, associadas à demência.</w:t>
       </w:r>
     </w:p>
     <w:p>
@@ -332,21 +383,239 @@
         <w:ind w:left="1410" w:firstLine="6"/>
         <w:rPr>
           <w:rFonts w:ascii="Arial" w:hAnsi="Arial" w:cs="Arial"/>
-        </w:rPr>
-      </w:pPr>
-      <w:r>
-        <w:rPr>
-          <w:rFonts w:ascii="Arial" w:hAnsi="Arial" w:cs="Arial"/>
           <w:lang w:val="pt-PT"/>
         </w:rPr>
+      </w:pPr>
+      <w:r>
+        <w:rPr>
+          <w:rFonts w:ascii="Arial" w:hAnsi="Arial" w:cs="Arial"/>
+          <w:b/>
+          <w:bCs/>
+          <w:lang w:val="pt-PT"/>
+        </w:rPr>
         <w:t xml:space="preserve">- </w:t>
       </w:r>
       <w:r>
         <w:rPr>
           <w:rFonts w:ascii="Arial" w:hAnsi="Arial" w:cs="Arial"/>
+          <w:b/>
+          <w:bCs/>
           <w:lang w:val="pt-PT"/>
         </w:rPr>
-        <w:t>Demência moderada: Sintomas de demência avançada, com alterações estruturais cerebrais significativas.</w:t>
+        <w:t>Demência moderada:</w:t>
+      </w:r>
+      <w:r>
+        <w:rPr>
+          <w:rFonts w:ascii="Arial" w:hAnsi="Arial" w:cs="Arial"/>
+          <w:lang w:val="pt-PT"/>
+        </w:rPr>
+        <w:t xml:space="preserve"> Sintomas de demência avançada, com alterações estruturais cerebrais significativas.</w:t>
+      </w:r>
+    </w:p>
+    <w:p>
+      <w:pPr>
+        <w:rPr>
+          <w:rFonts w:ascii="Arial" w:hAnsi="Arial" w:cs="Arial"/>
+        </w:rPr>
+      </w:pPr>
+    </w:p>
+    <w:p>
+      <w:pPr>
+        <w:rPr>
+          <w:rFonts w:ascii="Arial" w:hAnsi="Arial" w:cs="Arial"/>
+        </w:rPr>
+      </w:pPr>
+    </w:p>
+    <w:p>
+      <w:pPr>
+        <w:rPr>
+          <w:rFonts w:ascii="Arial" w:hAnsi="Arial" w:cs="Arial"/>
+        </w:rPr>
+      </w:pPr>
+    </w:p>
+    <w:p>
+      <w:pPr>
+        <w:rPr>
+          <w:rFonts w:ascii="Arial" w:hAnsi="Arial" w:cs="Arial"/>
+        </w:rPr>
+      </w:pPr>
+    </w:p>
+    <w:p>
+      <w:pPr>
+        <w:rPr>
+          <w:rFonts w:ascii="Arial" w:hAnsi="Arial" w:cs="Arial"/>
+        </w:rPr>
+      </w:pPr>
+    </w:p>
+    <w:p>
+      <w:pPr>
+        <w:rPr>
+          <w:rFonts w:ascii="Arial" w:hAnsi="Arial" w:cs="Arial"/>
+          <w:b/>
+          <w:bCs/>
+        </w:rPr>
+      </w:pPr>
+      <w:r>
+        <w:rPr>
+          <w:rFonts w:ascii="Arial" w:hAnsi="Arial" w:cs="Arial"/>
+          <w:b/>
+          <w:bCs/>
+        </w:rPr>
+        <w:lastRenderedPageBreak/>
+        <w:t>Pendências até o momento:</w:t>
+      </w:r>
+    </w:p>
+    <w:p>
+      <w:pPr>
+        <w:rPr>
+          <w:rFonts w:ascii="Arial" w:hAnsi="Arial" w:cs="Arial"/>
+        </w:rPr>
+      </w:pPr>
+      <w:r>
+        <w:rPr>
+          <w:rFonts w:ascii="Arial" w:hAnsi="Arial" w:cs="Arial"/>
+        </w:rPr>
+        <w:t xml:space="preserve">- Estrutura de quais algoritmos usaremos para fazer o </w:t>
+      </w:r>
+      <w:r>
+        <w:rPr>
+          <w:rFonts w:ascii="Arial" w:hAnsi="Arial" w:cs="Arial"/>
+          <w:i/>
+          <w:iCs/>
+        </w:rPr>
+        <w:t>Ensemble</w:t>
+      </w:r>
+      <w:r>
+        <w:rPr>
+          <w:rFonts w:ascii="Arial" w:hAnsi="Arial" w:cs="Arial"/>
+        </w:rPr>
+        <w:t>;</w:t>
+      </w:r>
+    </w:p>
+    <w:p>
+      <w:pPr>
+        <w:rPr>
+          <w:rFonts w:ascii="Arial" w:hAnsi="Arial" w:cs="Arial"/>
+        </w:rPr>
+      </w:pPr>
+    </w:p>
+    <w:p>
+      <w:pPr>
+        <w:rPr>
+          <w:rFonts w:ascii="Arial" w:hAnsi="Arial" w:cs="Arial"/>
+        </w:rPr>
+      </w:pPr>
+      <w:r>
+        <w:rPr>
+          <w:rFonts w:ascii="Arial" w:hAnsi="Arial" w:cs="Arial"/>
+        </w:rPr>
+        <w:t xml:space="preserve">- Fonte de utilização real e origem das imagens do </w:t>
+      </w:r>
+      <w:proofErr w:type="spellStart"/>
+      <w:r>
+        <w:rPr>
+          <w:rFonts w:ascii="Arial" w:hAnsi="Arial" w:cs="Arial"/>
+          <w:i/>
+          <w:iCs/>
+        </w:rPr>
+        <w:t>dataset</w:t>
+      </w:r>
+      <w:proofErr w:type="spellEnd"/>
+      <w:r>
+        <w:rPr>
+          <w:rFonts w:ascii="Arial" w:hAnsi="Arial" w:cs="Arial"/>
+        </w:rPr>
+        <w:t>;</w:t>
+      </w:r>
+    </w:p>
+    <w:p>
+      <w:pPr>
+        <w:rPr>
+          <w:rFonts w:ascii="Arial" w:hAnsi="Arial" w:cs="Arial"/>
+        </w:rPr>
+      </w:pPr>
+    </w:p>
+    <w:p>
+      <w:pPr>
+        <w:rPr>
+          <w:rFonts w:ascii="Arial" w:hAnsi="Arial" w:cs="Arial"/>
+        </w:rPr>
+      </w:pPr>
+      <w:r>
+        <w:rPr>
+          <w:rFonts w:ascii="Arial" w:hAnsi="Arial" w:cs="Arial"/>
+        </w:rPr>
+        <w:t xml:space="preserve">- Grupo de imagens para validação do modelo pós-treinamento; </w:t>
+      </w:r>
+      <w:r>
+        <w:rPr>
+          <w:rFonts w:ascii="Arial" w:hAnsi="Arial" w:cs="Arial"/>
+          <w:highlight w:val="yellow"/>
+        </w:rPr>
+        <w:t>SOFIA</w:t>
+      </w:r>
+    </w:p>
+    <w:p>
+      <w:pPr>
+        <w:rPr>
+          <w:rFonts w:ascii="Arial" w:hAnsi="Arial" w:cs="Arial"/>
+        </w:rPr>
+      </w:pPr>
+    </w:p>
+    <w:p>
+      <w:pPr>
+        <w:rPr>
+          <w:rFonts w:ascii="Arial" w:hAnsi="Arial" w:cs="Arial"/>
+        </w:rPr>
+      </w:pPr>
+      <w:r>
+        <w:rPr>
+          <w:rFonts w:ascii="Arial" w:hAnsi="Arial" w:cs="Arial"/>
+        </w:rPr>
+        <w:t xml:space="preserve">- Definição de épocas de treinamento com base nas imagens que temos; </w:t>
+      </w:r>
+      <w:r>
+        <w:rPr>
+          <w:rFonts w:ascii="Arial" w:hAnsi="Arial" w:cs="Arial"/>
+          <w:highlight w:val="yellow"/>
+        </w:rPr>
+        <w:t>GAZÃO</w:t>
+      </w:r>
+    </w:p>
+    <w:p>
+      <w:pPr>
+        <w:rPr>
+          <w:rFonts w:ascii="Arial" w:hAnsi="Arial" w:cs="Arial"/>
+        </w:rPr>
+      </w:pPr>
+      <w:r>
+        <w:rPr>
+          <w:rFonts w:ascii="Arial" w:hAnsi="Arial" w:cs="Arial"/>
+        </w:rPr>
+        <w:t xml:space="preserve">- Definição da proporção do grupo de teste, a partir do nosso </w:t>
+      </w:r>
+      <w:proofErr w:type="spellStart"/>
+      <w:r>
+        <w:rPr>
+          <w:rFonts w:ascii="Arial" w:hAnsi="Arial" w:cs="Arial"/>
+          <w:i/>
+          <w:iCs/>
+        </w:rPr>
+        <w:t>dataset</w:t>
+      </w:r>
+      <w:proofErr w:type="spellEnd"/>
+      <w:r>
+        <w:rPr>
+          <w:rFonts w:ascii="Arial" w:hAnsi="Arial" w:cs="Arial"/>
+        </w:rPr>
+        <w:t xml:space="preserve">; </w:t>
+      </w:r>
+      <w:r>
+        <w:rPr>
+          <w:rFonts w:ascii="Arial" w:hAnsi="Arial" w:cs="Arial"/>
+          <w:highlight w:val="yellow"/>
+        </w:rPr>
+        <w:t>GAZÃO</w:t>
       </w:r>
     </w:p>
     <w:p>

</xml_diff>